<commit_message>
update logic generation code
</commit_message>
<xml_diff>
--- a/core/static/kozu_p_pz_template.docx
+++ b/core/static/kozu_p_pz_template.docx
@@ -227,7 +227,6 @@
                 <w:highlight w:val="yellow"/>
               </w:rPr>
             </w:pPr>
-            <w:proofErr w:type="gramStart"/>
             <w:r>
               <w:rPr>
                 <w:sz w:val="28"/>
@@ -235,37 +234,16 @@
                 <w:highlight w:val="yellow"/>
                 <w:lang w:val="en-US"/>
               </w:rPr>
-              <w:t>{{ bartal</w:t>
-            </w:r>
-            <w:proofErr w:type="gramEnd"/>
+              <w:t>{{ bartal_code }}</w:t>
+            </w:r>
             <w:r>
               <w:rPr>
                 <w:sz w:val="28"/>
                 <w:szCs w:val="28"/>
                 <w:highlight w:val="yellow"/>
-                <w:lang w:val="en-US"/>
-              </w:rPr>
-              <w:t>_</w:t>
-            </w:r>
-            <w:proofErr w:type="gramStart"/>
-            <w:r>
-              <w:rPr>
-                <w:sz w:val="28"/>
-                <w:szCs w:val="28"/>
-                <w:highlight w:val="yellow"/>
-                <w:lang w:val="en-US"/>
-              </w:rPr>
-              <w:t>code }}</w:t>
-            </w:r>
-            <w:r>
-              <w:rPr>
-                <w:sz w:val="28"/>
-                <w:szCs w:val="28"/>
-                <w:highlight w:val="yellow"/>
               </w:rPr>
               <w:t>.С</w:t>
             </w:r>
-            <w:proofErr w:type="gramEnd"/>
           </w:p>
         </w:tc>
         <w:tc>
@@ -324,7 +302,6 @@
                 <w:highlight w:val="yellow"/>
               </w:rPr>
             </w:pPr>
-            <w:proofErr w:type="gramStart"/>
             <w:r>
               <w:rPr>
                 <w:sz w:val="28"/>
@@ -332,37 +309,16 @@
                 <w:highlight w:val="yellow"/>
                 <w:lang w:val="en-US"/>
               </w:rPr>
-              <w:t>{{ bartal</w:t>
-            </w:r>
-            <w:proofErr w:type="gramEnd"/>
+              <w:t>{{ bartal_code }}</w:t>
+            </w:r>
             <w:r>
               <w:rPr>
                 <w:sz w:val="28"/>
                 <w:szCs w:val="28"/>
                 <w:highlight w:val="yellow"/>
-                <w:lang w:val="en-US"/>
-              </w:rPr>
-              <w:t>_</w:t>
-            </w:r>
-            <w:proofErr w:type="gramStart"/>
-            <w:r>
-              <w:rPr>
-                <w:sz w:val="28"/>
-                <w:szCs w:val="28"/>
-                <w:highlight w:val="yellow"/>
-                <w:lang w:val="en-US"/>
-              </w:rPr>
-              <w:t>code }}</w:t>
-            </w:r>
-            <w:r>
-              <w:rPr>
-                <w:sz w:val="28"/>
-                <w:szCs w:val="28"/>
-                <w:highlight w:val="yellow"/>
               </w:rPr>
               <w:t>.ТЧ</w:t>
             </w:r>
-            <w:proofErr w:type="gramEnd"/>
           </w:p>
         </w:tc>
         <w:tc>
@@ -421,7 +377,6 @@
                 <w:highlight w:val="yellow"/>
               </w:rPr>
             </w:pPr>
-            <w:proofErr w:type="gramStart"/>
             <w:r>
               <w:rPr>
                 <w:sz w:val="28"/>
@@ -429,44 +384,15 @@
                 <w:highlight w:val="yellow"/>
                 <w:lang w:val="en-US"/>
               </w:rPr>
-              <w:t>{{ project</w:t>
-            </w:r>
-            <w:proofErr w:type="gramEnd"/>
+              <w:t>{{ project_code }}</w:t>
+            </w:r>
             <w:r>
               <w:rPr>
                 <w:sz w:val="28"/>
                 <w:szCs w:val="28"/>
                 <w:highlight w:val="yellow"/>
-                <w:lang w:val="en-US"/>
-              </w:rPr>
-              <w:t>_</w:t>
-            </w:r>
-            <w:proofErr w:type="gramStart"/>
-            <w:r>
-              <w:rPr>
-                <w:sz w:val="28"/>
-                <w:szCs w:val="28"/>
-                <w:highlight w:val="yellow"/>
-                <w:lang w:val="en-US"/>
-              </w:rPr>
-              <w:t>code }}</w:t>
-            </w:r>
-            <w:r>
-              <w:rPr>
-                <w:sz w:val="28"/>
-                <w:szCs w:val="28"/>
-                <w:highlight w:val="yellow"/>
-              </w:rPr>
-              <w:t>-</w:t>
-            </w:r>
-            <w:proofErr w:type="gramEnd"/>
-            <w:r>
-              <w:rPr>
-                <w:sz w:val="28"/>
-                <w:szCs w:val="28"/>
-                <w:highlight w:val="yellow"/>
-              </w:rPr>
-              <w:t>КР</w:t>
+              </w:rPr>
+              <w:t>-КР</w:t>
             </w:r>
           </w:p>
         </w:tc>
@@ -931,7 +857,6 @@
                 <w:szCs w:val="28"/>
               </w:rPr>
             </w:pPr>
-            <w:proofErr w:type="gramStart"/>
             <w:r>
               <w:rPr>
                 <w:sz w:val="28"/>
@@ -939,44 +864,15 @@
                 <w:highlight w:val="yellow"/>
                 <w:lang w:val="en-US"/>
               </w:rPr>
-              <w:t>{{ project</w:t>
-            </w:r>
-            <w:proofErr w:type="gramEnd"/>
+              <w:t>{{ project_code }}</w:t>
+            </w:r>
             <w:r>
               <w:rPr>
                 <w:sz w:val="28"/>
                 <w:szCs w:val="28"/>
                 <w:highlight w:val="yellow"/>
-                <w:lang w:val="en-US"/>
-              </w:rPr>
-              <w:t>_</w:t>
-            </w:r>
-            <w:proofErr w:type="gramStart"/>
-            <w:r>
-              <w:rPr>
-                <w:sz w:val="28"/>
-                <w:szCs w:val="28"/>
-                <w:highlight w:val="yellow"/>
-                <w:lang w:val="en-US"/>
-              </w:rPr>
-              <w:t>code }}</w:t>
-            </w:r>
-            <w:r>
-              <w:rPr>
-                <w:sz w:val="28"/>
-                <w:szCs w:val="28"/>
-                <w:highlight w:val="yellow"/>
-              </w:rPr>
-              <w:t>-</w:t>
-            </w:r>
-            <w:proofErr w:type="gramEnd"/>
-            <w:r>
-              <w:rPr>
-                <w:sz w:val="28"/>
-                <w:szCs w:val="28"/>
-                <w:highlight w:val="yellow"/>
-              </w:rPr>
-              <w:t>ПЧ</w:t>
+              </w:rPr>
+              <w:t>-ПЧ</w:t>
             </w:r>
           </w:p>
         </w:tc>
@@ -1194,7 +1090,6 @@
               </w:rPr>
               <w:t xml:space="preserve">Стойка </w:t>
             </w:r>
-            <w:proofErr w:type="gramStart"/>
             <w:r>
               <w:rPr>
                 <w:sz w:val="28"/>
@@ -1202,37 +1097,7 @@
                 <w:highlight w:val="yellow"/>
                 <w:lang w:val="en-US"/>
               </w:rPr>
-              <w:t>{{ dlina</w:t>
-            </w:r>
-            <w:proofErr w:type="gramEnd"/>
-            <w:r>
-              <w:rPr>
-                <w:sz w:val="28"/>
-                <w:szCs w:val="28"/>
-                <w:highlight w:val="yellow"/>
-                <w:lang w:val="en-US"/>
-              </w:rPr>
-              <w:t>_</w:t>
-            </w:r>
-            <w:proofErr w:type="gramStart"/>
-            <w:r>
-              <w:rPr>
-                <w:sz w:val="28"/>
-                <w:szCs w:val="28"/>
-                <w:highlight w:val="yellow"/>
-                <w:lang w:val="en-US"/>
-              </w:rPr>
-              <w:t>stoiki }</w:t>
-            </w:r>
-            <w:proofErr w:type="gramEnd"/>
-            <w:r>
-              <w:rPr>
-                <w:sz w:val="28"/>
-                <w:szCs w:val="28"/>
-                <w:highlight w:val="yellow"/>
-                <w:lang w:val="en-US"/>
-              </w:rPr>
-              <w:t>}</w:t>
+              <w:t>{{ dlina_stoiki }}</w:t>
             </w:r>
             <w:r>
               <w:rPr>
@@ -1308,7 +1173,6 @@
               </w:rPr>
               <w:t xml:space="preserve">Ригель </w:t>
             </w:r>
-            <w:proofErr w:type="gramStart"/>
             <w:r>
               <w:rPr>
                 <w:sz w:val="28"/>
@@ -1326,7 +1190,6 @@
               </w:rPr>
               <w:t>dlina</w:t>
             </w:r>
-            <w:proofErr w:type="gramEnd"/>
             <w:r>
               <w:rPr>
                 <w:sz w:val="28"/>
@@ -1350,25 +1213,23 @@
                 <w:szCs w:val="28"/>
                 <w:highlight w:val="yellow"/>
               </w:rPr>
-              <w:t>_</w:t>
-            </w:r>
-            <w:proofErr w:type="gramStart"/>
+              <w:t>_1 }}</w:t>
+            </w:r>
             <w:r>
               <w:rPr>
                 <w:sz w:val="28"/>
                 <w:szCs w:val="28"/>
                 <w:highlight w:val="yellow"/>
               </w:rPr>
-              <w:t>1 }</w:t>
-            </w:r>
-            <w:proofErr w:type="gramEnd"/>
+              <w:t xml:space="preserve"> м, </w:t>
+            </w:r>
             <w:r>
               <w:rPr>
                 <w:sz w:val="28"/>
                 <w:szCs w:val="28"/>
                 <w:highlight w:val="yellow"/>
               </w:rPr>
-              <w:t>}</w:t>
+              <w:t>Р</w:t>
             </w:r>
             <w:r>
               <w:rPr>
@@ -1376,25 +1237,8 @@
                 <w:szCs w:val="28"/>
                 <w:highlight w:val="yellow"/>
               </w:rPr>
-              <w:t xml:space="preserve"> м, </w:t>
-            </w:r>
-            <w:r>
-              <w:rPr>
-                <w:sz w:val="28"/>
-                <w:szCs w:val="28"/>
-                <w:highlight w:val="yellow"/>
-              </w:rPr>
-              <w:t>Р</w:t>
-            </w:r>
-            <w:r>
-              <w:rPr>
-                <w:sz w:val="28"/>
-                <w:szCs w:val="28"/>
-                <w:highlight w:val="yellow"/>
-              </w:rPr>
               <w:t xml:space="preserve">игель </w:t>
             </w:r>
-            <w:proofErr w:type="gramStart"/>
             <w:r>
               <w:rPr>
                 <w:sz w:val="28"/>
@@ -1412,7 +1256,6 @@
               </w:rPr>
               <w:t>dlina</w:t>
             </w:r>
-            <w:proofErr w:type="gramEnd"/>
             <w:r>
               <w:rPr>
                 <w:sz w:val="28"/>
@@ -1436,25 +1279,7 @@
                 <w:szCs w:val="28"/>
                 <w:highlight w:val="yellow"/>
               </w:rPr>
-              <w:t>_</w:t>
-            </w:r>
-            <w:proofErr w:type="gramStart"/>
-            <w:r>
-              <w:rPr>
-                <w:sz w:val="28"/>
-                <w:szCs w:val="28"/>
-                <w:highlight w:val="yellow"/>
-              </w:rPr>
-              <w:t>2 }</w:t>
-            </w:r>
-            <w:proofErr w:type="gramEnd"/>
-            <w:r>
-              <w:rPr>
-                <w:sz w:val="28"/>
-                <w:szCs w:val="28"/>
-                <w:highlight w:val="yellow"/>
-              </w:rPr>
-              <w:t xml:space="preserve">} </w:t>
+              <w:t xml:space="preserve">_2 }} </w:t>
             </w:r>
             <w:r>
               <w:rPr>
@@ -1531,7 +1356,6 @@
               </w:rPr>
               <w:t xml:space="preserve">Устройство </w:t>
             </w:r>
-            <w:proofErr w:type="gramStart"/>
             <w:r>
               <w:rPr>
                 <w:sz w:val="28"/>
@@ -1539,17 +1363,7 @@
                 <w:highlight w:val="yellow"/>
                 <w:lang w:val="en-US"/>
               </w:rPr>
-              <w:t>{{ set</w:t>
-            </w:r>
-            <w:proofErr w:type="gramEnd"/>
-            <w:r>
-              <w:rPr>
-                <w:sz w:val="28"/>
-                <w:szCs w:val="28"/>
-                <w:highlight w:val="yellow"/>
-                <w:lang w:val="en-US"/>
-              </w:rPr>
-              <w:t xml:space="preserve"> }}</w:t>
+              <w:t>{{ set }}</w:t>
             </w:r>
           </w:p>
         </w:tc>
@@ -1790,7 +1604,6 @@
               </w:rPr>
               <w:t xml:space="preserve"> </w:t>
             </w:r>
-            <w:proofErr w:type="gramStart"/>
             <w:r>
               <w:rPr>
                 <w:sz w:val="28"/>
@@ -1798,17 +1611,7 @@
                 <w:highlight w:val="yellow"/>
                 <w:lang w:val="en-US"/>
               </w:rPr>
-              <w:t>{{ ten</w:t>
-            </w:r>
-            <w:proofErr w:type="gramEnd"/>
-            <w:r>
-              <w:rPr>
-                <w:sz w:val="28"/>
-                <w:szCs w:val="28"/>
-                <w:highlight w:val="yellow"/>
-                <w:lang w:val="en-US"/>
-              </w:rPr>
-              <w:t xml:space="preserve"> }}</w:t>
+              <w:t>{{ ten }}</w:t>
             </w:r>
           </w:p>
         </w:tc>
@@ -1826,7 +1629,6 @@
                 <w:highlight w:val="yellow"/>
               </w:rPr>
             </w:pPr>
-            <w:proofErr w:type="gramStart"/>
             <w:r>
               <w:rPr>
                 <w:sz w:val="28"/>
@@ -1834,9 +1636,8 @@
                 <w:highlight w:val="yellow"/>
                 <w:lang w:val="en-US"/>
               </w:rPr>
-              <w:t>{{ fund</w:t>
-            </w:r>
-            <w:proofErr w:type="gramEnd"/>
+              <w:t xml:space="preserve">{{ </w:t>
+            </w:r>
             <w:r>
               <w:rPr>
                 <w:sz w:val="28"/>
@@ -1844,7 +1645,88 @@
                 <w:highlight w:val="yellow"/>
                 <w:lang w:val="en-US"/>
               </w:rPr>
-              <w:t>_or_ferma_usil }}</w:t>
+              <w:t>ustr_svai</w:t>
+            </w:r>
+            <w:r>
+              <w:rPr>
+                <w:sz w:val="28"/>
+                <w:szCs w:val="28"/>
+                <w:highlight w:val="yellow"/>
+                <w:lang w:val="en-US"/>
+              </w:rPr>
+              <w:t xml:space="preserve"> }}</w:t>
+            </w:r>
+          </w:p>
+        </w:tc>
+        <w:tc>
+          <w:tcPr>
+            <w:tcW w:w="1980" w:type="dxa"/>
+            <w:vAlign w:val="center"/>
+          </w:tcPr>
+          <w:p>
+            <w:pPr>
+              <w:jc w:val="center"/>
+              <w:rPr>
+                <w:sz w:val="28"/>
+                <w:szCs w:val="28"/>
+              </w:rPr>
+            </w:pPr>
+          </w:p>
+        </w:tc>
+      </w:tr>
+      <w:tr>
+        <w:trPr>
+          <w:trHeight w:val="340"/>
+        </w:trPr>
+        <w:tc>
+          <w:tcPr>
+            <w:tcW w:w="3161" w:type="dxa"/>
+            <w:vAlign w:val="center"/>
+          </w:tcPr>
+          <w:p>
+            <w:pPr>
+              <w:jc w:val="center"/>
+              <w:rPr>
+                <w:sz w:val="28"/>
+                <w:szCs w:val="28"/>
+                <w:highlight w:val="yellow"/>
+                <w:lang w:val="en-US"/>
+              </w:rPr>
+            </w:pPr>
+            <w:r>
+              <w:rPr>
+                <w:sz w:val="28"/>
+                <w:szCs w:val="28"/>
+                <w:highlight w:val="yellow"/>
+                <w:lang w:val="en-US"/>
+              </w:rPr>
+              <w:t>{{ eleven }}</w:t>
+            </w:r>
+          </w:p>
+        </w:tc>
+        <w:tc>
+          <w:tcPr>
+            <w:tcW w:w="4345" w:type="dxa"/>
+            <w:vAlign w:val="center"/>
+          </w:tcPr>
+          <w:p>
+            <w:pPr>
+              <w:jc w:val="center"/>
+              <w:rPr>
+                <w:sz w:val="28"/>
+                <w:szCs w:val="28"/>
+                <w:highlight w:val="yellow"/>
+                <w:lang w:val="en-US"/>
+              </w:rPr>
+            </w:pPr>
+            <w:r>
+              <w:rPr>
+                <w:sz w:val="28"/>
+                <w:szCs w:val="28"/>
+                <w:highlight w:val="yellow"/>
+                <w:lang w:val="en-US"/>
+              </w:rPr>
+              <w:t>{{ ferma_usil }}</w:t>
             </w:r>
           </w:p>
         </w:tc>
@@ -1947,7 +1829,6 @@
         </w:rPr>
         <w:t>«</w:t>
       </w:r>
-      <w:proofErr w:type="gramStart"/>
       <w:r>
         <w:rPr>
           <w:sz w:val="28"/>
@@ -1965,7 +1846,6 @@
         </w:rPr>
         <w:t>project</w:t>
       </w:r>
-      <w:proofErr w:type="gramEnd"/>
       <w:r>
         <w:rPr>
           <w:sz w:val="28"/>
@@ -4675,7 +4555,6 @@
         </w:rPr>
         <w:t>«</w:t>
       </w:r>
-      <w:proofErr w:type="gramStart"/>
       <w:r>
         <w:rPr>
           <w:sz w:val="28"/>
@@ -4693,7 +4572,6 @@
         </w:rPr>
         <w:t>object</w:t>
       </w:r>
-      <w:proofErr w:type="gramEnd"/>
       <w:r>
         <w:rPr>
           <w:sz w:val="28"/>
@@ -4702,7 +4580,6 @@
         </w:rPr>
         <w:t>_</w:t>
       </w:r>
-      <w:proofErr w:type="gramStart"/>
       <w:r>
         <w:rPr>
           <w:sz w:val="28"/>
@@ -4718,16 +4595,7 @@
           <w:szCs w:val="28"/>
           <w:highlight w:val="yellow"/>
         </w:rPr>
-        <w:t xml:space="preserve"> }</w:t>
-      </w:r>
-      <w:proofErr w:type="gramEnd"/>
-      <w:r>
-        <w:rPr>
-          <w:sz w:val="28"/>
-          <w:szCs w:val="28"/>
-          <w:highlight w:val="yellow"/>
-        </w:rPr>
-        <w:t>}</w:t>
+        <w:t xml:space="preserve"> }}</w:t>
       </w:r>
       <w:r>
         <w:rPr>
@@ -5124,7 +4992,6 @@
           <w:lang w:val="en-US"/>
         </w:rPr>
       </w:pPr>
-      <w:proofErr w:type="gramStart"/>
       <w:r>
         <w:rPr>
           <w:sz w:val="28"/>
@@ -5132,37 +4999,7 @@
           <w:highlight w:val="yellow"/>
           <w:lang w:val="en-US"/>
         </w:rPr>
-        <w:t>{{ zasch</w:t>
-      </w:r>
-      <w:proofErr w:type="gramEnd"/>
-      <w:r>
-        <w:rPr>
-          <w:sz w:val="28"/>
-          <w:szCs w:val="28"/>
-          <w:highlight w:val="yellow"/>
-          <w:lang w:val="en-US"/>
-        </w:rPr>
-        <w:t>_obj_list[i</w:t>
-      </w:r>
-      <w:proofErr w:type="gramStart"/>
-      <w:r>
-        <w:rPr>
-          <w:sz w:val="28"/>
-          <w:szCs w:val="28"/>
-          <w:highlight w:val="yellow"/>
-          <w:lang w:val="en-US"/>
-        </w:rPr>
-        <w:t>] }</w:t>
-      </w:r>
-      <w:proofErr w:type="gramEnd"/>
-      <w:r>
-        <w:rPr>
-          <w:sz w:val="28"/>
-          <w:szCs w:val="28"/>
-          <w:highlight w:val="yellow"/>
-          <w:lang w:val="en-US"/>
-        </w:rPr>
-        <w:t>}</w:t>
+        <w:t>{{ zasch_obj_list[i] }}</w:t>
       </w:r>
     </w:p>
     <w:p>
@@ -5335,63 +5172,78 @@
         <w:ind w:firstLine="426"/>
         <w:jc w:val="center"/>
         <w:rPr>
-          <w:color w:val="000000" w:themeColor="text1"/>
-          <w:sz w:val="28"/>
-          <w:szCs w:val="28"/>
-          <w:highlight w:val="yellow"/>
-        </w:rPr>
-      </w:pPr>
-      <w:r>
-        <w:rPr>
-          <w:noProof/>
-          <w:highlight w:val="yellow"/>
-        </w:rPr>
-        <w:t xml:space="preserve">{{ </w:t>
-      </w:r>
-      <w:r>
-        <w:rPr>
           <w:noProof/>
           <w:highlight w:val="yellow"/>
           <w:lang w:val="en-US"/>
         </w:rPr>
-        <w:t>vid</w:t>
-      </w:r>
-      <w:r>
-        <w:rPr>
-          <w:noProof/>
-          <w:highlight w:val="yellow"/>
-        </w:rPr>
-        <w:t>_</w:t>
-      </w:r>
+      </w:pPr>
       <w:r>
         <w:rPr>
           <w:noProof/>
           <w:highlight w:val="yellow"/>
           <w:lang w:val="en-US"/>
         </w:rPr>
-        <w:t>kozu</w:t>
-      </w:r>
-      <w:r>
-        <w:rPr>
-          <w:noProof/>
-          <w:highlight w:val="yellow"/>
-        </w:rPr>
-        <w:t>_</w:t>
-      </w:r>
-      <w:r>
+        <w:t>{%p for vid in vid_kozu_obj %}</w:t>
+      </w:r>
+    </w:p>
+    <w:p>
+      <w:pPr>
+        <w:keepNext/>
+        <w:spacing w:line="276" w:lineRule="auto"/>
+        <w:ind w:firstLine="426"/>
+        <w:jc w:val="center"/>
         <w:rPr>
           <w:noProof/>
           <w:highlight w:val="yellow"/>
           <w:lang w:val="en-US"/>
         </w:rPr>
-        <w:t>p</w:t>
-      </w:r>
+      </w:pPr>
       <w:r>
         <w:rPr>
           <w:noProof/>
           <w:highlight w:val="yellow"/>
+          <w:lang w:val="en-US"/>
+        </w:rPr>
+        <w:t xml:space="preserve">{{ </w:t>
+      </w:r>
+      <w:r>
+        <w:rPr>
+          <w:noProof/>
+          <w:highlight w:val="yellow"/>
+          <w:lang w:val="en-US"/>
+        </w:rPr>
+        <w:t>vid</w:t>
+      </w:r>
+      <w:r>
+        <w:rPr>
+          <w:noProof/>
+          <w:highlight w:val="yellow"/>
+          <w:lang w:val="en-US"/>
         </w:rPr>
         <w:t xml:space="preserve"> }}</w:t>
+      </w:r>
+    </w:p>
+    <w:p>
+      <w:pPr>
+        <w:keepNext/>
+        <w:spacing w:line="276" w:lineRule="auto"/>
+        <w:ind w:firstLine="426"/>
+        <w:jc w:val="center"/>
+        <w:rPr>
+          <w:color w:val="000000" w:themeColor="text1"/>
+          <w:sz w:val="28"/>
+          <w:szCs w:val="28"/>
+          <w:highlight w:val="yellow"/>
+          <w:lang w:val="en-US"/>
+        </w:rPr>
+      </w:pPr>
+      <w:r>
+        <w:rPr>
+          <w:noProof/>
+          <w:highlight w:val="yellow"/>
+          <w:lang w:val="en-US"/>
+        </w:rPr>
+        <w:t>{%p endfor %}</w:t>
       </w:r>
     </w:p>
     <w:p>
@@ -5604,41 +5456,13 @@
         </w:rPr>
         <w:t xml:space="preserve">расположен в </w:t>
       </w:r>
-      <w:proofErr w:type="gramStart"/>
       <w:r>
         <w:rPr>
           <w:sz w:val="28"/>
           <w:szCs w:val="28"/>
           <w:highlight w:val="yellow"/>
         </w:rPr>
-        <w:t>{{ rayon</w:t>
-      </w:r>
-      <w:proofErr w:type="gramEnd"/>
-      <w:r>
-        <w:rPr>
-          <w:sz w:val="28"/>
-          <w:szCs w:val="28"/>
-          <w:highlight w:val="yellow"/>
-        </w:rPr>
-        <w:t>_</w:t>
-      </w:r>
-      <w:proofErr w:type="gramStart"/>
-      <w:r>
-        <w:rPr>
-          <w:sz w:val="28"/>
-          <w:szCs w:val="28"/>
-          <w:highlight w:val="yellow"/>
-        </w:rPr>
-        <w:t>str }</w:t>
-      </w:r>
-      <w:proofErr w:type="gramEnd"/>
-      <w:r>
-        <w:rPr>
-          <w:sz w:val="28"/>
-          <w:szCs w:val="28"/>
-          <w:highlight w:val="yellow"/>
-        </w:rPr>
-        <w:t>}</w:t>
+        <w:t>{{ rayon_str }}</w:t>
       </w:r>
       <w:r>
         <w:rPr>
@@ -5690,7 +5514,6 @@
         </w:rPr>
         <w:t xml:space="preserve">В соответствии со схемой климатического районирования (СП 131.13330.2020 [24]) для строительства, участок изысканий расположен в строительной-климатической зоне </w:t>
       </w:r>
-      <w:proofErr w:type="gramStart"/>
       <w:r>
         <w:rPr>
           <w:sz w:val="28"/>
@@ -5708,7 +5531,6 @@
         </w:rPr>
         <w:t>str</w:t>
       </w:r>
-      <w:proofErr w:type="gramEnd"/>
       <w:r>
         <w:rPr>
           <w:sz w:val="28"/>
@@ -5734,7 +5556,6 @@
         </w:rPr>
         <w:t>_</w:t>
       </w:r>
-      <w:proofErr w:type="gramStart"/>
       <w:r>
         <w:rPr>
           <w:sz w:val="28"/>
@@ -5750,16 +5571,15 @@
           <w:szCs w:val="28"/>
           <w:highlight w:val="yellow"/>
         </w:rPr>
-        <w:t xml:space="preserve"> }</w:t>
-      </w:r>
-      <w:proofErr w:type="gramEnd"/>
+        <w:t xml:space="preserve"> }}</w:t>
+      </w:r>
       <w:r>
         <w:rPr>
           <w:sz w:val="28"/>
           <w:szCs w:val="28"/>
           <w:highlight w:val="yellow"/>
         </w:rPr>
-        <w:t>}</w:t>
+        <w:t xml:space="preserve">. Климат </w:t>
       </w:r>
       <w:r>
         <w:rPr>
@@ -5767,59 +5587,23 @@
           <w:szCs w:val="28"/>
           <w:highlight w:val="yellow"/>
         </w:rPr>
-        <w:t xml:space="preserve">. Климат </w:t>
-      </w:r>
-      <w:proofErr w:type="gramStart"/>
+        <w:t>{{ vid_klim</w:t>
+      </w:r>
       <w:r>
         <w:rPr>
           <w:sz w:val="28"/>
           <w:szCs w:val="28"/>
           <w:highlight w:val="yellow"/>
         </w:rPr>
-        <w:t>{{ vid</w:t>
-      </w:r>
-      <w:proofErr w:type="gramEnd"/>
+        <w:t xml:space="preserve"> </w:t>
+      </w:r>
       <w:r>
         <w:rPr>
           <w:sz w:val="28"/>
           <w:szCs w:val="28"/>
           <w:highlight w:val="yellow"/>
         </w:rPr>
-        <w:t>_</w:t>
-      </w:r>
-      <w:proofErr w:type="gramStart"/>
-      <w:r>
-        <w:rPr>
-          <w:sz w:val="28"/>
-          <w:szCs w:val="28"/>
-          <w:highlight w:val="yellow"/>
-        </w:rPr>
-        <w:t>klim</w:t>
-      </w:r>
-      <w:r>
-        <w:rPr>
-          <w:sz w:val="28"/>
-          <w:szCs w:val="28"/>
-          <w:highlight w:val="yellow"/>
-        </w:rPr>
-        <w:t xml:space="preserve"> </w:t>
-      </w:r>
-      <w:r>
-        <w:rPr>
-          <w:sz w:val="28"/>
-          <w:szCs w:val="28"/>
-          <w:highlight w:val="yellow"/>
-        </w:rPr>
-        <w:t>}</w:t>
-      </w:r>
-      <w:proofErr w:type="gramEnd"/>
-      <w:r>
-        <w:rPr>
-          <w:sz w:val="28"/>
-          <w:szCs w:val="28"/>
-          <w:highlight w:val="yellow"/>
-        </w:rPr>
-        <w:t>}</w:t>
+        <w:t>}}</w:t>
       </w:r>
       <w:r>
         <w:rPr>
@@ -6067,6 +5851,7 @@
                 <w:sz w:val="28"/>
                 <w:szCs w:val="28"/>
               </w:rPr>
+              <w:lastRenderedPageBreak/>
               <w:t>Температура воздуха, °С, обеспеченностью 0,95</w:t>
             </w:r>
           </w:p>
@@ -6157,7 +5942,6 @@
                 <w:sz w:val="28"/>
                 <w:szCs w:val="28"/>
               </w:rPr>
-              <w:lastRenderedPageBreak/>
               <w:t>Средняя максимальная температура воздуха наиболее теплого месяца, °С</w:t>
             </w:r>
           </w:p>
@@ -8218,41 +8002,44 @@
         </w:rPr>
         <w:t xml:space="preserve">району </w:t>
       </w:r>
-      <w:proofErr w:type="gramStart"/>
       <w:r>
         <w:rPr>
           <w:sz w:val="28"/>
           <w:szCs w:val="28"/>
           <w:highlight w:val="yellow"/>
         </w:rPr>
-        <w:t>{{ sp</w:t>
-      </w:r>
-      <w:proofErr w:type="gramEnd"/>
+        <w:t>{{ sp_wind_reg }}</w:t>
+      </w:r>
       <w:r>
         <w:rPr>
           <w:sz w:val="28"/>
           <w:szCs w:val="28"/>
           <w:highlight w:val="yellow"/>
         </w:rPr>
-        <w:t>_wind_</w:t>
-      </w:r>
-      <w:proofErr w:type="gramStart"/>
+        <w:t xml:space="preserve"> по</w:t>
+      </w:r>
+      <w:r>
+        <w:rPr>
+          <w:sz w:val="28"/>
+          <w:szCs w:val="28"/>
+        </w:rPr>
+        <w:t xml:space="preserve"> ветровому давлению. Нормативное значение ветрового давления w0 согласно таблице 11.1 СП 20.13330.2016 [26] рекомендуется принять </w:t>
+      </w:r>
       <w:r>
         <w:rPr>
           <w:sz w:val="28"/>
           <w:szCs w:val="28"/>
           <w:highlight w:val="yellow"/>
         </w:rPr>
-        <w:t>reg }</w:t>
-      </w:r>
-      <w:proofErr w:type="gramEnd"/>
+        <w:t xml:space="preserve">равным </w:t>
+      </w:r>
       <w:r>
         <w:rPr>
           <w:sz w:val="28"/>
           <w:szCs w:val="28"/>
           <w:highlight w:val="yellow"/>
         </w:rPr>
-        <w:t>}</w:t>
+        <w:t>{{ wind_nagr</w:t>
       </w:r>
       <w:r>
         <w:rPr>
@@ -8260,14 +8047,7 @@
           <w:szCs w:val="28"/>
           <w:highlight w:val="yellow"/>
         </w:rPr>
-        <w:t xml:space="preserve"> по</w:t>
-      </w:r>
-      <w:r>
-        <w:rPr>
-          <w:sz w:val="28"/>
-          <w:szCs w:val="28"/>
-        </w:rPr>
-        <w:t xml:space="preserve"> ветровому давлению. Нормативное значение ветрового давления w0 согласно таблице 11.1 СП 20.13330.2016 [26] рекомендуется принять </w:t>
+        <w:t xml:space="preserve"> </w:t>
       </w:r>
       <w:r>
         <w:rPr>
@@ -8275,59 +8055,7 @@
           <w:szCs w:val="28"/>
           <w:highlight w:val="yellow"/>
         </w:rPr>
-        <w:t xml:space="preserve">равным </w:t>
-      </w:r>
-      <w:proofErr w:type="gramStart"/>
-      <w:r>
-        <w:rPr>
-          <w:sz w:val="28"/>
-          <w:szCs w:val="28"/>
-          <w:highlight w:val="yellow"/>
-        </w:rPr>
-        <w:t>{{ wind</w:t>
-      </w:r>
-      <w:proofErr w:type="gramEnd"/>
-      <w:r>
-        <w:rPr>
-          <w:sz w:val="28"/>
-          <w:szCs w:val="28"/>
-          <w:highlight w:val="yellow"/>
-        </w:rPr>
-        <w:t>_</w:t>
-      </w:r>
-      <w:proofErr w:type="gramStart"/>
-      <w:r>
-        <w:rPr>
-          <w:sz w:val="28"/>
-          <w:szCs w:val="28"/>
-          <w:highlight w:val="yellow"/>
-        </w:rPr>
-        <w:t>nagr</w:t>
-      </w:r>
-      <w:r>
-        <w:rPr>
-          <w:sz w:val="28"/>
-          <w:szCs w:val="28"/>
-          <w:highlight w:val="yellow"/>
-        </w:rPr>
-        <w:t xml:space="preserve"> </w:t>
-      </w:r>
-      <w:r>
-        <w:rPr>
-          <w:sz w:val="28"/>
-          <w:szCs w:val="28"/>
-          <w:highlight w:val="yellow"/>
-        </w:rPr>
-        <w:t>}</w:t>
-      </w:r>
-      <w:proofErr w:type="gramEnd"/>
-      <w:r>
-        <w:rPr>
-          <w:sz w:val="28"/>
-          <w:szCs w:val="28"/>
-          <w:highlight w:val="yellow"/>
-        </w:rPr>
-        <w:t>}</w:t>
+        <w:t>}}</w:t>
       </w:r>
       <w:r>
         <w:rPr>
@@ -8370,32 +8098,29 @@
         </w:rPr>
         <w:t xml:space="preserve">ко </w:t>
       </w:r>
-      <w:proofErr w:type="gramStart"/>
       <w:r>
         <w:rPr>
           <w:sz w:val="28"/>
           <w:szCs w:val="28"/>
           <w:highlight w:val="yellow"/>
         </w:rPr>
-        <w:t>{{ golol</w:t>
-      </w:r>
-      <w:proofErr w:type="gramEnd"/>
+        <w:t>{{ golol_rayon</w:t>
+      </w:r>
       <w:r>
         <w:rPr>
           <w:sz w:val="28"/>
           <w:szCs w:val="28"/>
           <w:highlight w:val="yellow"/>
         </w:rPr>
-        <w:t>_</w:t>
-      </w:r>
-      <w:proofErr w:type="gramStart"/>
+        <w:t xml:space="preserve"> </w:t>
+      </w:r>
       <w:r>
         <w:rPr>
           <w:sz w:val="28"/>
           <w:szCs w:val="28"/>
           <w:highlight w:val="yellow"/>
         </w:rPr>
-        <w:t>rayon</w:t>
+        <w:t>}}</w:t>
       </w:r>
       <w:r>
         <w:rPr>
@@ -8403,7 +8128,14 @@
           <w:szCs w:val="28"/>
           <w:highlight w:val="yellow"/>
         </w:rPr>
-        <w:t xml:space="preserve"> </w:t>
+        <w:t xml:space="preserve"> району</w:t>
+      </w:r>
+      <w:r>
+        <w:rPr>
+          <w:sz w:val="28"/>
+          <w:szCs w:val="28"/>
+        </w:rPr>
+        <w:t xml:space="preserve"> по толщине стенки гололеда, нормативная толщина стенки гололеда для </w:t>
       </w:r>
       <w:r>
         <w:rPr>
@@ -8411,41 +8143,8 @@
           <w:szCs w:val="28"/>
           <w:highlight w:val="yellow"/>
         </w:rPr>
-        <w:t>}</w:t>
-      </w:r>
-      <w:proofErr w:type="gramEnd"/>
-      <w:r>
-        <w:rPr>
-          <w:sz w:val="28"/>
-          <w:szCs w:val="28"/>
-          <w:highlight w:val="yellow"/>
-        </w:rPr>
-        <w:t>}</w:t>
-      </w:r>
-      <w:r>
-        <w:rPr>
-          <w:sz w:val="28"/>
-          <w:szCs w:val="28"/>
-          <w:highlight w:val="yellow"/>
-        </w:rPr>
-        <w:t xml:space="preserve"> району</w:t>
-      </w:r>
-      <w:r>
-        <w:rPr>
-          <w:sz w:val="28"/>
-          <w:szCs w:val="28"/>
-        </w:rPr>
-        <w:t xml:space="preserve"> по толщине стенки гололеда, нормативная толщина стенки гололеда для </w:t>
-      </w:r>
-      <w:r>
-        <w:rPr>
-          <w:sz w:val="28"/>
-          <w:szCs w:val="28"/>
-          <w:highlight w:val="yellow"/>
-        </w:rPr>
         <w:t xml:space="preserve">района – </w:t>
       </w:r>
-      <w:proofErr w:type="gramStart"/>
       <w:r>
         <w:rPr>
           <w:sz w:val="28"/>
@@ -8463,7 +8162,6 @@
         </w:rPr>
         <w:t>golol</w:t>
       </w:r>
-      <w:proofErr w:type="gramEnd"/>
       <w:r>
         <w:rPr>
           <w:sz w:val="28"/>
@@ -8472,7 +8170,6 @@
         </w:rPr>
         <w:t>_</w:t>
       </w:r>
-      <w:proofErr w:type="gramStart"/>
       <w:r>
         <w:rPr>
           <w:sz w:val="28"/>
@@ -8488,16 +8185,7 @@
           <w:szCs w:val="28"/>
           <w:highlight w:val="yellow"/>
         </w:rPr>
-        <w:t xml:space="preserve"> }</w:t>
-      </w:r>
-      <w:proofErr w:type="gramEnd"/>
-      <w:r>
-        <w:rPr>
-          <w:sz w:val="28"/>
-          <w:szCs w:val="28"/>
-          <w:highlight w:val="yellow"/>
-        </w:rPr>
-        <w:t>}</w:t>
+        <w:t xml:space="preserve"> }}</w:t>
       </w:r>
       <w:r>
         <w:rPr>
@@ -8589,7 +8277,6 @@
         </w:rPr>
         <w:t xml:space="preserve">работ </w:t>
       </w:r>
-      <w:proofErr w:type="gramStart"/>
       <w:r>
         <w:rPr>
           <w:sz w:val="28"/>
@@ -8607,7 +8294,6 @@
         </w:rPr>
         <w:t>seism</w:t>
       </w:r>
-      <w:proofErr w:type="gramEnd"/>
       <w:r>
         <w:rPr>
           <w:sz w:val="28"/>
@@ -10124,7 +9810,6 @@
         </w:rPr>
         <w:t>2 «</w:t>
       </w:r>
-      <w:proofErr w:type="gramStart"/>
       <w:r>
         <w:rPr>
           <w:color w:val="000000" w:themeColor="text1"/>
@@ -10144,7 +9829,6 @@
         </w:rPr>
         <w:t>project</w:t>
       </w:r>
-      <w:proofErr w:type="gramEnd"/>
       <w:r>
         <w:rPr>
           <w:color w:val="000000" w:themeColor="text1"/>
@@ -10154,7 +9838,6 @@
         </w:rPr>
         <w:t>_</w:t>
       </w:r>
-      <w:proofErr w:type="gramStart"/>
       <w:r>
         <w:rPr>
           <w:color w:val="000000" w:themeColor="text1"/>
@@ -10181,17 +9864,7 @@
           <w:szCs w:val="28"/>
           <w:highlight w:val="yellow"/>
         </w:rPr>
-        <w:t>-</w:t>
-      </w:r>
-      <w:proofErr w:type="gramEnd"/>
-      <w:r>
-        <w:rPr>
-          <w:color w:val="000000" w:themeColor="text1"/>
-          <w:sz w:val="28"/>
-          <w:szCs w:val="28"/>
-          <w:highlight w:val="yellow"/>
-        </w:rPr>
-        <w:t>ПЧ</w:t>
+        <w:t>-ПЧ</w:t>
       </w:r>
       <w:r>
         <w:rPr>
@@ -10472,7 +10145,6 @@
           <w:highlight w:val="yellow"/>
         </w:rPr>
       </w:pPr>
-      <w:proofErr w:type="gramStart"/>
       <w:r>
         <w:rPr>
           <w:color w:val="000000" w:themeColor="text1"/>
@@ -10481,40 +10153,7 @@
           <w:highlight w:val="yellow"/>
           <w:lang w:val="en-US"/>
         </w:rPr>
-        <w:t>{{ is</w:t>
-      </w:r>
-      <w:proofErr w:type="gramEnd"/>
-      <w:r>
-        <w:rPr>
-          <w:color w:val="000000" w:themeColor="text1"/>
-          <w:sz w:val="28"/>
-          <w:szCs w:val="28"/>
-          <w:highlight w:val="yellow"/>
-          <w:lang w:val="en-US"/>
-        </w:rPr>
-        <w:t>_ferma_</w:t>
-      </w:r>
-      <w:proofErr w:type="gramStart"/>
-      <w:r>
-        <w:rPr>
-          <w:color w:val="000000" w:themeColor="text1"/>
-          <w:sz w:val="28"/>
-          <w:szCs w:val="28"/>
-          <w:highlight w:val="yellow"/>
-          <w:lang w:val="en-US"/>
-        </w:rPr>
-        <w:t>usileniya }</w:t>
-      </w:r>
-      <w:proofErr w:type="gramEnd"/>
-      <w:r>
-        <w:rPr>
-          <w:color w:val="000000" w:themeColor="text1"/>
-          <w:sz w:val="28"/>
-          <w:szCs w:val="28"/>
-          <w:highlight w:val="yellow"/>
-          <w:lang w:val="en-US"/>
-        </w:rPr>
-        <w:t>}</w:t>
+        <w:t>{{ is_ferma_usileniya }}</w:t>
       </w:r>
     </w:p>
     <w:p>
@@ -10533,7 +10172,6 @@
           <w:highlight w:val="yellow"/>
         </w:rPr>
       </w:pPr>
-      <w:proofErr w:type="gramStart"/>
       <w:r>
         <w:rPr>
           <w:color w:val="000000" w:themeColor="text1"/>
@@ -10542,40 +10180,7 @@
           <w:highlight w:val="yellow"/>
           <w:lang w:val="en-US"/>
         </w:rPr>
-        <w:t>{{ is</w:t>
-      </w:r>
-      <w:proofErr w:type="gramEnd"/>
-      <w:r>
-        <w:rPr>
-          <w:color w:val="000000" w:themeColor="text1"/>
-          <w:sz w:val="28"/>
-          <w:szCs w:val="28"/>
-          <w:highlight w:val="yellow"/>
-          <w:lang w:val="en-US"/>
-        </w:rPr>
-        <w:t>_trosovaya_</w:t>
-      </w:r>
-      <w:proofErr w:type="gramStart"/>
-      <w:r>
-        <w:rPr>
-          <w:color w:val="000000" w:themeColor="text1"/>
-          <w:sz w:val="28"/>
-          <w:szCs w:val="28"/>
-          <w:highlight w:val="yellow"/>
-          <w:lang w:val="en-US"/>
-        </w:rPr>
-        <w:t>ferma }</w:t>
-      </w:r>
-      <w:proofErr w:type="gramEnd"/>
-      <w:r>
-        <w:rPr>
-          <w:color w:val="000000" w:themeColor="text1"/>
-          <w:sz w:val="28"/>
-          <w:szCs w:val="28"/>
-          <w:highlight w:val="yellow"/>
-          <w:lang w:val="en-US"/>
-        </w:rPr>
-        <w:t>}</w:t>
+        <w:t>{{ is_trosovaya_ferma }}</w:t>
       </w:r>
     </w:p>
     <w:p>
@@ -12358,7 +11963,6 @@
         </w:rPr>
         <w:t xml:space="preserve">. </w:t>
       </w:r>
-      <w:proofErr w:type="gramStart"/>
       <w:r>
         <w:rPr>
           <w:color w:val="000000" w:themeColor="text1"/>
@@ -12378,7 +11982,6 @@
         </w:rPr>
         <w:t>sbros</w:t>
       </w:r>
-      <w:proofErr w:type="gramEnd"/>
       <w:r>
         <w:rPr>
           <w:color w:val="000000" w:themeColor="text1"/>
@@ -12427,7 +12030,6 @@
           <w:shd w:val="clear" w:color="auto" w:fill="FFFFFF"/>
         </w:rPr>
       </w:pPr>
-      <w:proofErr w:type="gramStart"/>
       <w:r>
         <w:rPr>
           <w:sz w:val="28"/>
@@ -12447,7 +12049,6 @@
         </w:rPr>
         <w:t>fundament</w:t>
       </w:r>
-      <w:proofErr w:type="gramEnd"/>
       <w:r>
         <w:rPr>
           <w:sz w:val="28"/>
@@ -12669,7 +12270,6 @@
         </w:rPr>
         <w:t xml:space="preserve"> </w:t>
       </w:r>
-      <w:proofErr w:type="gramStart"/>
       <w:r>
         <w:rPr>
           <w:sz w:val="28"/>
@@ -12694,7 +12294,6 @@
         </w:rPr>
         <w:t>fund</w:t>
       </w:r>
-      <w:proofErr w:type="gramEnd"/>
       <w:r>
         <w:rPr>
           <w:sz w:val="28"/>
@@ -12703,7 +12302,6 @@
         </w:rPr>
         <w:t>_</w:t>
       </w:r>
-      <w:proofErr w:type="gramStart"/>
       <w:r>
         <w:rPr>
           <w:sz w:val="28"/>
@@ -12719,16 +12317,7 @@
           <w:szCs w:val="28"/>
           <w:highlight w:val="yellow"/>
         </w:rPr>
-        <w:t xml:space="preserve"> }</w:t>
-      </w:r>
-      <w:proofErr w:type="gramEnd"/>
-      <w:r>
-        <w:rPr>
-          <w:sz w:val="28"/>
-          <w:szCs w:val="28"/>
-          <w:highlight w:val="yellow"/>
-        </w:rPr>
-        <w:t>}</w:t>
+        <w:t xml:space="preserve"> }}</w:t>
       </w:r>
       <w:r>
         <w:rPr>
@@ -12747,6 +12336,7 @@
         <w:rPr>
           <w:sz w:val="28"/>
           <w:szCs w:val="28"/>
+          <w:lang w:val="en-US"/>
         </w:rPr>
       </w:pPr>
       <w:r>
@@ -12755,138 +12345,6 @@
           <w:szCs w:val="28"/>
         </w:rPr>
         <w:t>Таким образом, принятые объемно-планировочные решения соответствуют функциональному назначению объекта, требованиям механической прочности, электробезопасности, удобству монтажа и эксплуатации, а также обеспечивают рациональное использование территории подстанции.</w:t>
-      </w:r>
-    </w:p>
-    <w:p>
-      <w:pPr>
-        <w:spacing w:line="276" w:lineRule="auto"/>
-        <w:ind w:firstLine="426"/>
-        <w:jc w:val="both"/>
-        <w:rPr>
-          <w:rFonts w:eastAsia="TimesNewRomanPSMT"/>
-          <w:sz w:val="28"/>
-          <w:szCs w:val="28"/>
-          <w:highlight w:val="yellow"/>
-        </w:rPr>
-      </w:pPr>
-      <w:r>
-        <w:rPr>
-          <w:rFonts w:eastAsia="TimesNewRomanPSMT"/>
-          <w:sz w:val="28"/>
-          <w:szCs w:val="28"/>
-        </w:rPr>
-        <w:t>Технико-экономическая характеристика объекта защиты для</w:t>
-      </w:r>
-      <w:r>
-        <w:rPr>
-          <w:sz w:val="28"/>
-          <w:szCs w:val="28"/>
-        </w:rPr>
-        <w:t xml:space="preserve"> </w:t>
-      </w:r>
-      <w:r>
-        <w:rPr>
-          <w:sz w:val="28"/>
-          <w:szCs w:val="28"/>
-          <w:highlight w:val="yellow"/>
-        </w:rPr>
-        <w:t>трансформаторов</w:t>
-      </w:r>
-      <w:r>
-        <w:rPr>
-          <w:rFonts w:eastAsia="TimesNewRomanPSMT"/>
-          <w:sz w:val="28"/>
-          <w:szCs w:val="28"/>
-          <w:highlight w:val="yellow"/>
-        </w:rPr>
-        <w:t>:</w:t>
-      </w:r>
-    </w:p>
-    <w:p>
-      <w:pPr>
-        <w:rPr>
-          <w:sz w:val="28"/>
-          <w:szCs w:val="28"/>
-          <w:highlight w:val="yellow"/>
-          <w:lang w:val="en-US"/>
-        </w:rPr>
-      </w:pPr>
-      <w:r>
-        <w:rPr>
-          <w:sz w:val="28"/>
-          <w:szCs w:val="28"/>
-          <w:highlight w:val="yellow"/>
-          <w:lang w:val="en-US"/>
-        </w:rPr>
-        <w:t>{%p for i in range(kozu_pz|length) %}</w:t>
-      </w:r>
-    </w:p>
-    <w:p>
-      <w:pPr>
-        <w:rPr>
-          <w:sz w:val="28"/>
-          <w:szCs w:val="28"/>
-          <w:highlight w:val="yellow"/>
-          <w:lang w:val="en-US"/>
-        </w:rPr>
-      </w:pPr>
-      <w:proofErr w:type="gramStart"/>
-      <w:r>
-        <w:rPr>
-          <w:sz w:val="28"/>
-          <w:szCs w:val="28"/>
-          <w:highlight w:val="yellow"/>
-          <w:lang w:val="en-US"/>
-        </w:rPr>
-        <w:t>{{ kozu</w:t>
-      </w:r>
-      <w:proofErr w:type="gramEnd"/>
-      <w:r>
-        <w:rPr>
-          <w:sz w:val="28"/>
-          <w:szCs w:val="28"/>
-          <w:highlight w:val="yellow"/>
-          <w:lang w:val="en-US"/>
-        </w:rPr>
-        <w:t>_pz[i</w:t>
-      </w:r>
-      <w:proofErr w:type="gramStart"/>
-      <w:r>
-        <w:rPr>
-          <w:sz w:val="28"/>
-          <w:szCs w:val="28"/>
-          <w:highlight w:val="yellow"/>
-          <w:lang w:val="en-US"/>
-        </w:rPr>
-        <w:t>] }</w:t>
-      </w:r>
-      <w:proofErr w:type="gramEnd"/>
-      <w:r>
-        <w:rPr>
-          <w:sz w:val="28"/>
-          <w:szCs w:val="28"/>
-          <w:highlight w:val="yellow"/>
-          <w:lang w:val="en-US"/>
-        </w:rPr>
-        <w:t>}</w:t>
-      </w:r>
-    </w:p>
-    <w:p>
-      <w:pPr>
-        <w:rPr>
-          <w:sz w:val="28"/>
-          <w:szCs w:val="28"/>
-          <w:lang w:val="en-US"/>
-        </w:rPr>
-      </w:pPr>
-      <w:r>
-        <w:rPr>
-          <w:sz w:val="28"/>
-          <w:szCs w:val="28"/>
-          <w:highlight w:val="yellow"/>
-          <w:lang w:val="en-US"/>
-        </w:rPr>
-        <w:t>{%p endfor %}</w:t>
       </w:r>
     </w:p>
     <w:p>
@@ -13051,7 +12509,6 @@
       </w:pPr>
       <w:bookmarkStart w:id="144" w:name="_Toc204166518"/>
       <w:r>
-        <w:lastRenderedPageBreak/>
         <w:t xml:space="preserve"> </w:t>
       </w:r>
       <w:bookmarkStart w:id="145" w:name="_Toc204695610"/>
@@ -13099,6 +12556,7 @@
       </w:pPr>
       <w:bookmarkStart w:id="146" w:name="_Toc204166519"/>
       <w:r>
+        <w:lastRenderedPageBreak/>
         <w:t xml:space="preserve"> </w:t>
       </w:r>
       <w:bookmarkStart w:id="147" w:name="_Toc204695611"/>
@@ -13251,7 +12709,6 @@
           <w:szCs w:val="28"/>
         </w:rPr>
       </w:pPr>
-      <w:proofErr w:type="gramStart"/>
       <w:r>
         <w:rPr>
           <w:sz w:val="28"/>
@@ -13275,16 +12732,7 @@
           <w:szCs w:val="28"/>
           <w:highlight w:val="yellow"/>
         </w:rPr>
-        <w:t>0 }</w:t>
-      </w:r>
-      <w:proofErr w:type="gramEnd"/>
-      <w:r>
-        <w:rPr>
-          <w:sz w:val="28"/>
-          <w:szCs w:val="28"/>
-          <w:highlight w:val="yellow"/>
-        </w:rPr>
-        <w:t>}.</w:t>
+        <w:t>0 }}.</w:t>
       </w:r>
     </w:p>
     <w:p>
@@ -14110,7 +13558,6 @@
               </w:rPr>
               <w:t xml:space="preserve"> = </w:t>
             </w:r>
-            <w:proofErr w:type="gramStart"/>
             <w:r>
               <w:rPr>
                 <w:bCs/>
@@ -14140,18 +13587,7 @@
                 <w:szCs w:val="28"/>
                 <w:highlight w:val="yellow"/>
               </w:rPr>
-              <w:t>1 }</w:t>
-            </w:r>
-            <w:proofErr w:type="gramEnd"/>
-            <w:r>
-              <w:rPr>
-                <w:bCs/>
-                <w:color w:val="000000" w:themeColor="text1"/>
-                <w:sz w:val="28"/>
-                <w:szCs w:val="28"/>
-                <w:highlight w:val="yellow"/>
-              </w:rPr>
-              <w:t>}</w:t>
+              <w:t>1 }}</w:t>
             </w:r>
             <w:r>
               <w:rPr>
@@ -14210,7 +13646,6 @@
               </w:rPr>
               <w:t xml:space="preserve"> = </w:t>
             </w:r>
-            <w:proofErr w:type="gramStart"/>
             <w:r>
               <w:rPr>
                 <w:bCs/>
@@ -14232,7 +13667,6 @@
               </w:rPr>
               <w:t>h</w:t>
             </w:r>
-            <w:proofErr w:type="gramEnd"/>
             <w:r>
               <w:rPr>
                 <w:bCs/>
@@ -14308,9 +13742,8 @@
                 <w:szCs w:val="28"/>
                 <w:highlight w:val="yellow"/>
               </w:rPr>
-              <w:t xml:space="preserve"> </w:t>
-            </w:r>
-            <w:proofErr w:type="gramStart"/>
+              <w:t xml:space="preserve"> =</w:t>
+            </w:r>
             <w:r>
               <w:rPr>
                 <w:bCs/>
@@ -14319,7 +13752,7 @@
                 <w:szCs w:val="28"/>
                 <w:highlight w:val="yellow"/>
               </w:rPr>
-              <w:t>=</w:t>
+              <w:t xml:space="preserve">{{ </w:t>
             </w:r>
             <w:r>
               <w:rPr>
@@ -14328,8 +13761,9 @@
                 <w:sz w:val="28"/>
                 <w:szCs w:val="28"/>
                 <w:highlight w:val="yellow"/>
-              </w:rPr>
-              <w:t xml:space="preserve">{{ </w:t>
+                <w:lang w:val="en-US"/>
+              </w:rPr>
+              <w:t>r</w:t>
             </w:r>
             <w:r>
               <w:rPr>
@@ -14338,30 +13772,8 @@
                 <w:sz w:val="28"/>
                 <w:szCs w:val="28"/>
                 <w:highlight w:val="yellow"/>
-                <w:lang w:val="en-US"/>
-              </w:rPr>
-              <w:t>r</w:t>
-            </w:r>
-            <w:r>
-              <w:rPr>
-                <w:bCs/>
-                <w:color w:val="000000" w:themeColor="text1"/>
-                <w:sz w:val="28"/>
-                <w:szCs w:val="28"/>
-                <w:highlight w:val="yellow"/>
-              </w:rPr>
-              <w:t>2 }</w:t>
-            </w:r>
-            <w:proofErr w:type="gramEnd"/>
-            <w:r>
-              <w:rPr>
-                <w:bCs/>
-                <w:color w:val="000000" w:themeColor="text1"/>
-                <w:sz w:val="28"/>
-                <w:szCs w:val="28"/>
-                <w:highlight w:val="yellow"/>
-              </w:rPr>
-              <w:t>}</w:t>
+              </w:rPr>
+              <w:t>2 }}</w:t>
             </w:r>
             <w:r>
               <w:rPr>
@@ -14718,7 +14130,6 @@
         </w:rPr>
         <w:t xml:space="preserve">– </w:t>
       </w:r>
-      <w:proofErr w:type="gramStart"/>
       <w:r>
         <w:rPr>
           <w:sz w:val="28"/>
@@ -14736,7 +14147,6 @@
         </w:rPr>
         <w:t>kozup</w:t>
       </w:r>
-      <w:proofErr w:type="gramEnd"/>
       <w:r>
         <w:rPr>
           <w:sz w:val="28"/>
@@ -14745,7 +14155,6 @@
         </w:rPr>
         <w:t>_</w:t>
       </w:r>
-      <w:proofErr w:type="gramStart"/>
       <w:r>
         <w:rPr>
           <w:sz w:val="28"/>
@@ -14761,16 +14170,7 @@
           <w:szCs w:val="28"/>
           <w:highlight w:val="yellow"/>
         </w:rPr>
-        <w:t xml:space="preserve"> }</w:t>
-      </w:r>
-      <w:proofErr w:type="gramEnd"/>
-      <w:r>
-        <w:rPr>
-          <w:sz w:val="28"/>
-          <w:szCs w:val="28"/>
-          <w:highlight w:val="yellow"/>
-        </w:rPr>
-        <w:t>}</w:t>
+        <w:t xml:space="preserve"> }}</w:t>
       </w:r>
       <w:r>
         <w:rPr>
@@ -17300,23 +16700,7 @@
           <w:szCs w:val="28"/>
         </w:rPr>
         <w:lastRenderedPageBreak/>
-        <w:t xml:space="preserve">ГОСТ 9467–75. </w:t>
-      </w:r>
-      <w:proofErr w:type="gramStart"/>
-      <w:r>
-        <w:rPr>
-          <w:sz w:val="28"/>
-          <w:szCs w:val="28"/>
-        </w:rPr>
-        <w:t>Электроды</w:t>
-      </w:r>
-      <w:proofErr w:type="gramEnd"/>
-      <w:r>
-        <w:rPr>
-          <w:sz w:val="28"/>
-          <w:szCs w:val="28"/>
-        </w:rPr>
-        <w:t xml:space="preserve"> покрытые металлические для ручной дуговой сварки конструкционных и теплоустойчивых сталей. Технические условия: утвержден и введен в действие постановлением Государственного комитета стандартов Совета Министров СССР от 29.12.1975 № 3045; дата введения 1977-01-01. – Текст: электронный.</w:t>
+        <w:t>ГОСТ 9467–75. Электроды покрытые металлические для ручной дуговой сварки конструкционных и теплоустойчивых сталей. Технические условия: утвержден и введен в действие постановлением Государственного комитета стандартов Совета Министров СССР от 29.12.1975 № 3045; дата введения 1977-01-01. – Текст: электронный.</w:t>
       </w:r>
     </w:p>
     <w:p>
@@ -19148,32 +18532,13 @@
                                 <w:szCs w:val="28"/>
                               </w:rPr>
                             </w:pPr>
-                            <w:proofErr w:type="gramStart"/>
                             <w:r>
                               <w:rPr>
                                 <w:sz w:val="32"/>
                                 <w:szCs w:val="44"/>
                                 <w:lang w:val="en-US"/>
                               </w:rPr>
-                              <w:t>{{ bartal</w:t>
-                            </w:r>
-                            <w:proofErr w:type="gramEnd"/>
-                            <w:r>
-                              <w:rPr>
-                                <w:sz w:val="32"/>
-                                <w:szCs w:val="44"/>
-                                <w:lang w:val="en-US"/>
-                              </w:rPr>
-                              <w:t>_</w:t>
-                            </w:r>
-                            <w:proofErr w:type="gramStart"/>
-                            <w:r>
-                              <w:rPr>
-                                <w:sz w:val="32"/>
-                                <w:szCs w:val="44"/>
-                                <w:lang w:val="en-US"/>
-                              </w:rPr>
-                              <w:t>code }}</w:t>
+                              <w:t>{{ bartal_code }}</w:t>
                             </w:r>
                             <w:r>
                               <w:rPr>
@@ -19182,7 +18547,6 @@
                               </w:rPr>
                               <w:t>.ТЧ</w:t>
                             </w:r>
-                            <w:proofErr w:type="gramEnd"/>
                           </w:p>
                           <w:p>
                             <w:pPr>
@@ -20623,32 +19987,13 @@
                           <w:szCs w:val="28"/>
                         </w:rPr>
                       </w:pPr>
-                      <w:proofErr w:type="gramStart"/>
                       <w:r>
                         <w:rPr>
                           <w:sz w:val="32"/>
                           <w:szCs w:val="44"/>
                           <w:lang w:val="en-US"/>
                         </w:rPr>
-                        <w:t>{{ bartal</w:t>
-                      </w:r>
-                      <w:proofErr w:type="gramEnd"/>
-                      <w:r>
-                        <w:rPr>
-                          <w:sz w:val="32"/>
-                          <w:szCs w:val="44"/>
-                          <w:lang w:val="en-US"/>
-                        </w:rPr>
-                        <w:t>_</w:t>
-                      </w:r>
-                      <w:proofErr w:type="gramStart"/>
-                      <w:r>
-                        <w:rPr>
-                          <w:sz w:val="32"/>
-                          <w:szCs w:val="44"/>
-                          <w:lang w:val="en-US"/>
-                        </w:rPr>
-                        <w:t>code }}</w:t>
+                        <w:t>{{ bartal_code }}</w:t>
                       </w:r>
                       <w:r>
                         <w:rPr>
@@ -20657,7 +20002,6 @@
                         </w:rPr>
                         <w:t>.ТЧ</w:t>
                       </w:r>
-                      <w:proofErr w:type="gramEnd"/>
                     </w:p>
                     <w:p>
                       <w:pPr>
@@ -21491,23 +20835,13 @@
                                 <w:lang w:val="en-US"/>
                               </w:rPr>
                             </w:pPr>
-                            <w:proofErr w:type="gramStart"/>
                             <w:r>
                               <w:rPr>
                                 <w:sz w:val="20"/>
                                 <w:szCs w:val="20"/>
                                 <w:lang w:val="en-US"/>
                               </w:rPr>
-                              <w:t>{{ year</w:t>
-                            </w:r>
-                            <w:proofErr w:type="gramEnd"/>
-                            <w:r>
-                              <w:rPr>
-                                <w:sz w:val="20"/>
-                                <w:szCs w:val="20"/>
-                                <w:lang w:val="en-US"/>
-                              </w:rPr>
-                              <w:t xml:space="preserve"> }}</w:t>
+                              <w:t>{{ year }}</w:t>
                             </w:r>
                           </w:p>
                         </w:txbxContent>
@@ -21559,23 +20893,13 @@
                                 <w:lang w:val="en-US"/>
                               </w:rPr>
                             </w:pPr>
-                            <w:proofErr w:type="gramStart"/>
                             <w:r>
                               <w:rPr>
                                 <w:sz w:val="20"/>
                                 <w:szCs w:val="20"/>
                                 <w:lang w:val="en-US"/>
                               </w:rPr>
-                              <w:t>{{ year</w:t>
-                            </w:r>
-                            <w:proofErr w:type="gramEnd"/>
-                            <w:r>
-                              <w:rPr>
-                                <w:sz w:val="20"/>
-                                <w:szCs w:val="20"/>
-                                <w:lang w:val="en-US"/>
-                              </w:rPr>
-                              <w:t xml:space="preserve"> }}</w:t>
+                              <w:t>{{ year }}</w:t>
                             </w:r>
                           </w:p>
                         </w:txbxContent>
@@ -22069,16 +21393,7 @@
                                 <w:sz w:val="18"/>
                                 <w:szCs w:val="18"/>
                               </w:rPr>
-                              <w:t>№</w:t>
-                            </w:r>
-                            <w:proofErr w:type="gramStart"/>
-                            <w:r>
-                              <w:rPr>
-                                <w:rFonts w:ascii="Arial" w:hAnsi="Arial" w:cs="Arial"/>
-                                <w:sz w:val="18"/>
-                                <w:szCs w:val="18"/>
-                              </w:rPr>
-                              <w:t>док.д</w:t>
+                              <w:t>№док.д</w:t>
                             </w:r>
                             <w:r>
                               <w:rPr>
@@ -22088,18 +21403,7 @@
                                 <w:sz w:val="18"/>
                                 <w:szCs w:val="18"/>
                               </w:rPr>
-                              <w:t>ок</w:t>
-                            </w:r>
-                            <w:proofErr w:type="gramEnd"/>
-                            <w:r>
-                              <w:rPr>
-                                <w:rFonts w:ascii="ISOCPEUR" w:hAnsi="ISOCPEUR" w:cs="Segoe UI"/>
-                                <w:i/>
-                                <w:iCs/>
-                                <w:sz w:val="18"/>
-                                <w:szCs w:val="18"/>
-                              </w:rPr>
-                              <w:t>.док.</w:t>
+                              <w:t>ок.док.</w:t>
                             </w:r>
                           </w:p>
                         </w:txbxContent>
@@ -22915,41 +22219,13 @@
                                 <w:szCs w:val="28"/>
                               </w:rPr>
                             </w:pPr>
-                            <w:proofErr w:type="gramStart"/>
                             <w:r>
                               <w:rPr>
                                 <w:sz w:val="32"/>
                                 <w:szCs w:val="44"/>
                                 <w:lang w:val="en-US"/>
                               </w:rPr>
-                              <w:t>{{ bartal</w:t>
-                            </w:r>
-                            <w:proofErr w:type="gramEnd"/>
-                            <w:r>
-                              <w:rPr>
-                                <w:sz w:val="32"/>
-                                <w:szCs w:val="44"/>
-                                <w:lang w:val="en-US"/>
-                              </w:rPr>
-                              <w:t>_</w:t>
-                            </w:r>
-                            <w:proofErr w:type="gramStart"/>
-                            <w:r>
-                              <w:rPr>
-                                <w:sz w:val="32"/>
-                                <w:szCs w:val="44"/>
-                                <w:lang w:val="en-US"/>
-                              </w:rPr>
-                              <w:t>code }</w:t>
-                            </w:r>
-                            <w:proofErr w:type="gramEnd"/>
-                            <w:r>
-                              <w:rPr>
-                                <w:sz w:val="32"/>
-                                <w:szCs w:val="44"/>
-                                <w:lang w:val="en-US"/>
-                              </w:rPr>
-                              <w:t>}</w:t>
+                              <w:t>{{ bartal_code }}</w:t>
                             </w:r>
                             <w:r>
                               <w:rPr>
@@ -22958,7 +22234,6 @@
                               </w:rPr>
                               <w:t>.</w:t>
                             </w:r>
-                            <w:proofErr w:type="gramStart"/>
                             <w:r>
                               <w:rPr>
                                 <w:sz w:val="32"/>
@@ -22981,7 +22256,6 @@
                               </w:rPr>
                               <w:t>С</w:t>
                             </w:r>
-                            <w:proofErr w:type="gramEnd"/>
                           </w:p>
                         </w:txbxContent>
                       </wps:txbx>
@@ -24904,23 +24178,13 @@
                           <w:lang w:val="en-US"/>
                         </w:rPr>
                       </w:pPr>
-                      <w:proofErr w:type="gramStart"/>
                       <w:r>
                         <w:rPr>
                           <w:sz w:val="20"/>
                           <w:szCs w:val="20"/>
                           <w:lang w:val="en-US"/>
                         </w:rPr>
-                        <w:t>{{ year</w:t>
-                      </w:r>
-                      <w:proofErr w:type="gramEnd"/>
-                      <w:r>
-                        <w:rPr>
-                          <w:sz w:val="20"/>
-                          <w:szCs w:val="20"/>
-                          <w:lang w:val="en-US"/>
-                        </w:rPr>
-                        <w:t xml:space="preserve"> }}</w:t>
+                        <w:t>{{ year }}</w:t>
                       </w:r>
                     </w:p>
                   </w:txbxContent>
@@ -24938,23 +24202,13 @@
                           <w:lang w:val="en-US"/>
                         </w:rPr>
                       </w:pPr>
-                      <w:proofErr w:type="gramStart"/>
                       <w:r>
                         <w:rPr>
                           <w:sz w:val="20"/>
                           <w:szCs w:val="20"/>
                           <w:lang w:val="en-US"/>
                         </w:rPr>
-                        <w:t>{{ year</w:t>
-                      </w:r>
-                      <w:proofErr w:type="gramEnd"/>
-                      <w:r>
-                        <w:rPr>
-                          <w:sz w:val="20"/>
-                          <w:szCs w:val="20"/>
-                          <w:lang w:val="en-US"/>
-                        </w:rPr>
-                        <w:t xml:space="preserve"> }}</w:t>
+                        <w:t>{{ year }}</w:t>
                       </w:r>
                     </w:p>
                   </w:txbxContent>
@@ -25156,16 +24410,7 @@
                           <w:sz w:val="18"/>
                           <w:szCs w:val="18"/>
                         </w:rPr>
-                        <w:t>№</w:t>
-                      </w:r>
-                      <w:proofErr w:type="gramStart"/>
-                      <w:r>
-                        <w:rPr>
-                          <w:rFonts w:ascii="Arial" w:hAnsi="Arial" w:cs="Arial"/>
-                          <w:sz w:val="18"/>
-                          <w:szCs w:val="18"/>
-                        </w:rPr>
-                        <w:t>док.д</w:t>
+                        <w:t>№док.д</w:t>
                       </w:r>
                       <w:r>
                         <w:rPr>
@@ -25175,18 +24420,7 @@
                           <w:sz w:val="18"/>
                           <w:szCs w:val="18"/>
                         </w:rPr>
-                        <w:t>ок</w:t>
-                      </w:r>
-                      <w:proofErr w:type="gramEnd"/>
-                      <w:r>
-                        <w:rPr>
-                          <w:rFonts w:ascii="ISOCPEUR" w:hAnsi="ISOCPEUR" w:cs="Segoe UI"/>
-                          <w:i/>
-                          <w:iCs/>
-                          <w:sz w:val="18"/>
-                          <w:szCs w:val="18"/>
-                        </w:rPr>
-                        <w:t>.док.</w:t>
+                        <w:t>ок.док.</w:t>
                       </w:r>
                     </w:p>
                   </w:txbxContent>
@@ -25487,41 +24721,13 @@
                           <w:szCs w:val="28"/>
                         </w:rPr>
                       </w:pPr>
-                      <w:proofErr w:type="gramStart"/>
                       <w:r>
                         <w:rPr>
                           <w:sz w:val="32"/>
                           <w:szCs w:val="44"/>
                           <w:lang w:val="en-US"/>
                         </w:rPr>
-                        <w:t>{{ bartal</w:t>
-                      </w:r>
-                      <w:proofErr w:type="gramEnd"/>
-                      <w:r>
-                        <w:rPr>
-                          <w:sz w:val="32"/>
-                          <w:szCs w:val="44"/>
-                          <w:lang w:val="en-US"/>
-                        </w:rPr>
-                        <w:t>_</w:t>
-                      </w:r>
-                      <w:proofErr w:type="gramStart"/>
-                      <w:r>
-                        <w:rPr>
-                          <w:sz w:val="32"/>
-                          <w:szCs w:val="44"/>
-                          <w:lang w:val="en-US"/>
-                        </w:rPr>
-                        <w:t>code }</w:t>
-                      </w:r>
-                      <w:proofErr w:type="gramEnd"/>
-                      <w:r>
-                        <w:rPr>
-                          <w:sz w:val="32"/>
-                          <w:szCs w:val="44"/>
-                          <w:lang w:val="en-US"/>
-                        </w:rPr>
-                        <w:t>}</w:t>
+                        <w:t>{{ bartal_code }}</w:t>
                       </w:r>
                       <w:r>
                         <w:rPr>
@@ -25530,7 +24736,6 @@
                         </w:rPr>
                         <w:t>.</w:t>
                       </w:r>
-                      <w:proofErr w:type="gramStart"/>
                       <w:r>
                         <w:rPr>
                           <w:sz w:val="32"/>
@@ -25553,7 +24758,6 @@
                         </w:rPr>
                         <w:t>С</w:t>
                       </w:r>
-                      <w:proofErr w:type="gramEnd"/>
                     </w:p>
                   </w:txbxContent>
                 </v:textbox>
@@ -26520,23 +25724,13 @@
                                 <w:lang w:val="en-US"/>
                               </w:rPr>
                             </w:pPr>
-                            <w:proofErr w:type="gramStart"/>
                             <w:r>
                               <w:rPr>
                                 <w:sz w:val="20"/>
                                 <w:szCs w:val="20"/>
                                 <w:lang w:val="en-US"/>
                               </w:rPr>
-                              <w:t>{{ year</w:t>
-                            </w:r>
-                            <w:proofErr w:type="gramEnd"/>
-                            <w:r>
-                              <w:rPr>
-                                <w:sz w:val="20"/>
-                                <w:szCs w:val="20"/>
-                                <w:lang w:val="en-US"/>
-                              </w:rPr>
-                              <w:t xml:space="preserve"> }}</w:t>
+                              <w:t>{{ year }}</w:t>
                             </w:r>
                           </w:p>
                         </w:txbxContent>
@@ -26589,23 +25783,13 @@
                                 <w:lang w:val="en-US"/>
                               </w:rPr>
                             </w:pPr>
-                            <w:proofErr w:type="gramStart"/>
                             <w:r>
                               <w:rPr>
                                 <w:sz w:val="20"/>
                                 <w:szCs w:val="20"/>
                                 <w:lang w:val="en-US"/>
                               </w:rPr>
-                              <w:t>{{ year</w:t>
-                            </w:r>
-                            <w:proofErr w:type="gramEnd"/>
-                            <w:r>
-                              <w:rPr>
-                                <w:sz w:val="20"/>
-                                <w:szCs w:val="20"/>
-                                <w:lang w:val="en-US"/>
-                              </w:rPr>
-                              <w:t xml:space="preserve"> }}</w:t>
+                              <w:t>{{ year }}</w:t>
                             </w:r>
                           </w:p>
                         </w:txbxContent>
@@ -27091,7 +26275,6 @@
                               </w:rPr>
                               <w:t>№</w:t>
                             </w:r>
-                            <w:proofErr w:type="gramStart"/>
                             <w:r>
                               <w:rPr>
                                 <w:sz w:val="18"/>
@@ -27115,18 +26298,7 @@
                                 <w:sz w:val="18"/>
                                 <w:szCs w:val="18"/>
                               </w:rPr>
-                              <w:t>ок</w:t>
-                            </w:r>
-                            <w:proofErr w:type="gramEnd"/>
-                            <w:r>
-                              <w:rPr>
-                                <w:rFonts w:ascii="ISOCPEUR" w:hAnsi="ISOCPEUR" w:cs="Segoe UI"/>
-                                <w:i/>
-                                <w:iCs/>
-                                <w:sz w:val="18"/>
-                                <w:szCs w:val="18"/>
-                              </w:rPr>
-                              <w:t>.док.</w:t>
+                              <w:t>ок.док.</w:t>
                             </w:r>
                           </w:p>
                         </w:txbxContent>
@@ -27941,32 +27113,13 @@
                                 <w:szCs w:val="28"/>
                               </w:rPr>
                             </w:pPr>
-                            <w:proofErr w:type="gramStart"/>
                             <w:r>
                               <w:rPr>
                                 <w:sz w:val="32"/>
                                 <w:szCs w:val="44"/>
                                 <w:lang w:val="en-US"/>
                               </w:rPr>
-                              <w:t>{{ bartal</w:t>
-                            </w:r>
-                            <w:proofErr w:type="gramEnd"/>
-                            <w:r>
-                              <w:rPr>
-                                <w:sz w:val="32"/>
-                                <w:szCs w:val="44"/>
-                                <w:lang w:val="en-US"/>
-                              </w:rPr>
-                              <w:t>_</w:t>
-                            </w:r>
-                            <w:proofErr w:type="gramStart"/>
-                            <w:r>
-                              <w:rPr>
-                                <w:sz w:val="32"/>
-                                <w:szCs w:val="44"/>
-                                <w:lang w:val="en-US"/>
-                              </w:rPr>
-                              <w:t>code }}</w:t>
+                              <w:t>{{ bartal_code }}</w:t>
                             </w:r>
                             <w:r>
                               <w:rPr>
@@ -27975,7 +27128,6 @@
                               </w:rPr>
                               <w:t>.ТЧ</w:t>
                             </w:r>
-                            <w:proofErr w:type="gramEnd"/>
                           </w:p>
                         </w:txbxContent>
                       </wps:txbx>
@@ -29902,23 +29054,13 @@
                           <w:lang w:val="en-US"/>
                         </w:rPr>
                       </w:pPr>
-                      <w:proofErr w:type="gramStart"/>
                       <w:r>
                         <w:rPr>
                           <w:sz w:val="20"/>
                           <w:szCs w:val="20"/>
                           <w:lang w:val="en-US"/>
                         </w:rPr>
-                        <w:t>{{ year</w:t>
-                      </w:r>
-                      <w:proofErr w:type="gramEnd"/>
-                      <w:r>
-                        <w:rPr>
-                          <w:sz w:val="20"/>
-                          <w:szCs w:val="20"/>
-                          <w:lang w:val="en-US"/>
-                        </w:rPr>
-                        <w:t xml:space="preserve"> }}</w:t>
+                        <w:t>{{ year }}</w:t>
                       </w:r>
                     </w:p>
                   </w:txbxContent>
@@ -29937,23 +29079,13 @@
                           <w:lang w:val="en-US"/>
                         </w:rPr>
                       </w:pPr>
-                      <w:proofErr w:type="gramStart"/>
                       <w:r>
                         <w:rPr>
                           <w:sz w:val="20"/>
                           <w:szCs w:val="20"/>
                           <w:lang w:val="en-US"/>
                         </w:rPr>
-                        <w:t>{{ year</w:t>
-                      </w:r>
-                      <w:proofErr w:type="gramEnd"/>
-                      <w:r>
-                        <w:rPr>
-                          <w:sz w:val="20"/>
-                          <w:szCs w:val="20"/>
-                          <w:lang w:val="en-US"/>
-                        </w:rPr>
-                        <w:t xml:space="preserve"> }}</w:t>
+                        <w:t>{{ year }}</w:t>
                       </w:r>
                     </w:p>
                   </w:txbxContent>
@@ -30147,7 +29279,6 @@
                         </w:rPr>
                         <w:t>№</w:t>
                       </w:r>
-                      <w:proofErr w:type="gramStart"/>
                       <w:r>
                         <w:rPr>
                           <w:sz w:val="18"/>
@@ -30171,18 +29302,7 @@
                           <w:sz w:val="18"/>
                           <w:szCs w:val="18"/>
                         </w:rPr>
-                        <w:t>ок</w:t>
-                      </w:r>
-                      <w:proofErr w:type="gramEnd"/>
-                      <w:r>
-                        <w:rPr>
-                          <w:rFonts w:ascii="ISOCPEUR" w:hAnsi="ISOCPEUR" w:cs="Segoe UI"/>
-                          <w:i/>
-                          <w:iCs/>
-                          <w:sz w:val="18"/>
-                          <w:szCs w:val="18"/>
-                        </w:rPr>
-                        <w:t>.док.</w:t>
+                        <w:t>ок.док.</w:t>
                       </w:r>
                     </w:p>
                   </w:txbxContent>
@@ -30482,32 +29602,13 @@
                           <w:szCs w:val="28"/>
                         </w:rPr>
                       </w:pPr>
-                      <w:proofErr w:type="gramStart"/>
                       <w:r>
                         <w:rPr>
                           <w:sz w:val="32"/>
                           <w:szCs w:val="44"/>
                           <w:lang w:val="en-US"/>
                         </w:rPr>
-                        <w:t>{{ bartal</w:t>
-                      </w:r>
-                      <w:proofErr w:type="gramEnd"/>
-                      <w:r>
-                        <w:rPr>
-                          <w:sz w:val="32"/>
-                          <w:szCs w:val="44"/>
-                          <w:lang w:val="en-US"/>
-                        </w:rPr>
-                        <w:t>_</w:t>
-                      </w:r>
-                      <w:proofErr w:type="gramStart"/>
-                      <w:r>
-                        <w:rPr>
-                          <w:sz w:val="32"/>
-                          <w:szCs w:val="44"/>
-                          <w:lang w:val="en-US"/>
-                        </w:rPr>
-                        <w:t>code }}</w:t>
+                        <w:t>{{ bartal_code }}</w:t>
                       </w:r>
                       <w:r>
                         <w:rPr>
@@ -30516,7 +29617,6 @@
                         </w:rPr>
                         <w:t>.ТЧ</w:t>
                       </w:r>
-                      <w:proofErr w:type="gramEnd"/>
                     </w:p>
                   </w:txbxContent>
                 </v:textbox>

</xml_diff>

<commit_message>
make titul and automation logic
</commit_message>
<xml_diff>
--- a/core/static/kozu_p_pz_template.docx
+++ b/core/static/kozu_p_pz_template.docx
@@ -5195,30 +5195,27 @@
         <w:rPr>
           <w:noProof/>
           <w:highlight w:val="yellow"/>
-          <w:lang w:val="en-US"/>
-        </w:rPr>
-      </w:pPr>
+        </w:rPr>
+      </w:pPr>
+      <w:r>
+        <w:rPr>
+          <w:noProof/>
+          <w:highlight w:val="yellow"/>
+        </w:rPr>
+        <w:t xml:space="preserve">{{ </w:t>
+      </w:r>
       <w:r>
         <w:rPr>
           <w:noProof/>
           <w:highlight w:val="yellow"/>
           <w:lang w:val="en-US"/>
         </w:rPr>
-        <w:t xml:space="preserve">{{ </w:t>
+        <w:t>vid</w:t>
       </w:r>
       <w:r>
         <w:rPr>
           <w:noProof/>
           <w:highlight w:val="yellow"/>
-          <w:lang w:val="en-US"/>
-        </w:rPr>
-        <w:t>vid</w:t>
-      </w:r>
-      <w:r>
-        <w:rPr>
-          <w:noProof/>
-          <w:highlight w:val="yellow"/>
-          <w:lang w:val="en-US"/>
         </w:rPr>
         <w:t xml:space="preserve"> }}</w:t>
       </w:r>
@@ -5234,16 +5231,44 @@
           <w:sz w:val="28"/>
           <w:szCs w:val="28"/>
           <w:highlight w:val="yellow"/>
-          <w:lang w:val="en-US"/>
-        </w:rPr>
-      </w:pPr>
+        </w:rPr>
+      </w:pPr>
+      <w:r>
+        <w:rPr>
+          <w:noProof/>
+          <w:highlight w:val="yellow"/>
+        </w:rPr>
+        <w:t>{%</w:t>
+      </w:r>
       <w:r>
         <w:rPr>
           <w:noProof/>
           <w:highlight w:val="yellow"/>
           <w:lang w:val="en-US"/>
         </w:rPr>
-        <w:t>{%p endfor %}</w:t>
+        <w:t>p</w:t>
+      </w:r>
+      <w:r>
+        <w:rPr>
+          <w:noProof/>
+          <w:highlight w:val="yellow"/>
+        </w:rPr>
+        <w:t xml:space="preserve"> </w:t>
+      </w:r>
+      <w:r>
+        <w:rPr>
+          <w:noProof/>
+          <w:highlight w:val="yellow"/>
+          <w:lang w:val="en-US"/>
+        </w:rPr>
+        <w:t>endfor</w:t>
+      </w:r>
+      <w:r>
+        <w:rPr>
+          <w:noProof/>
+          <w:highlight w:val="yellow"/>
+        </w:rPr>
+        <w:t xml:space="preserve"> %}</w:t>
       </w:r>
     </w:p>
     <w:p>
@@ -10131,6 +10156,30 @@
     </w:p>
     <w:p>
       <w:pPr>
+        <w:spacing w:after="120" w:line="276" w:lineRule="auto"/>
+        <w:contextualSpacing/>
+        <w:jc w:val="both"/>
+        <w:rPr>
+          <w:color w:val="000000" w:themeColor="text1"/>
+          <w:sz w:val="28"/>
+          <w:szCs w:val="28"/>
+          <w:highlight w:val="yellow"/>
+          <w:lang w:val="en-US"/>
+        </w:rPr>
+      </w:pPr>
+      <w:r>
+        <w:rPr>
+          <w:color w:val="000000" w:themeColor="text1"/>
+          <w:sz w:val="28"/>
+          <w:szCs w:val="28"/>
+          <w:highlight w:val="yellow"/>
+          <w:lang w:val="en-US"/>
+        </w:rPr>
+        <w:t>{%p for ferma in ferma_list %}</w:t>
+      </w:r>
+    </w:p>
+    <w:p>
+      <w:pPr>
         <w:numPr>
           <w:ilvl w:val="0"/>
           <w:numId w:val="13"/>
@@ -10153,15 +10202,11 @@
           <w:highlight w:val="yellow"/>
           <w:lang w:val="en-US"/>
         </w:rPr>
-        <w:t>{{ is_ferma_usileniya }}</w:t>
+        <w:t>{{ ferma }}</w:t>
       </w:r>
     </w:p>
     <w:p>
       <w:pPr>
-        <w:numPr>
-          <w:ilvl w:val="0"/>
-          <w:numId w:val="13"/>
-        </w:numPr>
         <w:spacing w:after="120" w:line="276" w:lineRule="auto"/>
         <w:contextualSpacing/>
         <w:jc w:val="both"/>
@@ -10180,7 +10225,7 @@
           <w:highlight w:val="yellow"/>
           <w:lang w:val="en-US"/>
         </w:rPr>
-        <w:t>{{ is_trosovaya_ferma }}</w:t>
+        <w:t>{%p endfor%}</w:t>
       </w:r>
     </w:p>
     <w:p>
@@ -12336,7 +12381,6 @@
         <w:rPr>
           <w:sz w:val="28"/>
           <w:szCs w:val="28"/>
-          <w:lang w:val="en-US"/>
         </w:rPr>
       </w:pPr>
       <w:r>
@@ -12355,7 +12399,6 @@
         <w:rPr>
           <w:sz w:val="28"/>
           <w:szCs w:val="28"/>
-          <w:lang w:val="en-US"/>
         </w:rPr>
       </w:pPr>
     </w:p>
@@ -12365,9 +12408,6 @@
       </w:pPr>
       <w:bookmarkStart w:id="138" w:name="_Toc204166515"/>
       <w:r>
-        <w:rPr>
-          <w:lang w:val="en-US"/>
-        </w:rPr>
         <w:t xml:space="preserve"> </w:t>
       </w:r>
       <w:bookmarkStart w:id="139" w:name="_Toc204695607"/>
@@ -13813,6 +13853,15 @@
           <w:szCs w:val="28"/>
         </w:rPr>
       </w:pPr>
+      <w:r>
+        <w:rPr>
+          <w:color w:val="000000" w:themeColor="text1"/>
+          <w:sz w:val="28"/>
+          <w:szCs w:val="28"/>
+          <w:highlight w:val="yellow"/>
+        </w:rPr>
+        <w:t>{</w:t>
+      </w:r>
       <w:r>
         <w:rPr>
           <w:color w:val="000000" w:themeColor="text1"/>

</xml_diff>